<commit_message>
UI item & template choice
</commit_message>
<xml_diff>
--- a/example_output.docx
+++ b/example_output.docx
@@ -33,7 +33,7 @@
         <w:spacing w:after="40"/>
       </w:pPr>
       <w:r>
-        <w:t>Claimant: Tymon RaciĹ„ski</w:t>
+        <w:t>Claimant: John Doe</w:t>
       </w:r>
     </w:p>
     <w:p>
@@ -41,7 +41,7 @@
         <w:spacing w:after="40"/>
       </w:pPr>
       <w:r>
-        <w:t>Address: 456 Git St, 67890 GdaĹ„sk</w:t>
+        <w:t>Address: 123 Main St, 12345 Anytown</w:t>
       </w:r>
     </w:p>
     <w:p>
@@ -81,7 +81,7 @@
         <w:spacing w:after="120"/>
       </w:pPr>
       <w:r>
-        <w:t>The Claimant states that the Respondent owes the amount of 1000 in connection with the disputed matter. This demand is made without limiting any rights, remedies, or claims available under applicable law.</w:t>
+        <w:t>The Claimant states that the Respondent owes the amount of  in connection with the disputed matter. This demand is made without limiting any rights, remedies, or claims available under applicable law.</w:t>
       </w:r>
     </w:p>
     <w:p>
@@ -97,7 +97,7 @@
         <w:spacing w:after="120"/>
       </w:pPr>
       <w:r>
-        <w:t>To resolve the lawsuit without further proceedings, the Claimant demands payment of 1000 as a full settlement amount, subject to the terms stated in the Settlement Schedule referenced below.</w:t>
+        <w:t>To resolve the lawsuit without further proceedings, the Claimant demands payment of  as a full settlement amount, subject to the terms stated in the Settlement Schedule referenced below.</w:t>
       </w:r>
     </w:p>
     <w:p>
@@ -105,7 +105,7 @@
         <w:spacing w:after="120"/>
       </w:pPr>
       <w:r>
-        <w:t>Payment must be received within 30 days after delivery of this notice. If payment is not received within that period, the Claimant may continue the lawsuit and seek any relief permitted by law, including applicable costs and interest.</w:t>
+        <w:t>Payment must be received within  days after delivery of this notice. If payment is not received within that period, the Claimant may continue the lawsuit and seek any relief permitted by law, including applicable costs and interest.</w:t>
       </w:r>
     </w:p>
     <w:p>
@@ -177,7 +177,7 @@
         <w:spacing w:after="40"/>
       </w:pPr>
       <w:r>
-        <w:t>Claimant: Tymon RaciĹ„ski</w:t>
+        <w:t>Claimant: John Doe</w:t>
       </w:r>
     </w:p>
     <w:p>
@@ -185,7 +185,7 @@
         <w:spacing w:after="0"/>
       </w:pPr>
       <w:r>
-        <w:t>Date: 05.09.2026</w:t>
+        <w:t>Date: 12.09.2026</w:t>
       </w:r>
     </w:p>
     <w:sectPr>

</xml_diff>